<commit_message>
Update public/database.json and research dossiers with John Pearson & Clifton Park museum
</commit_message>
<xml_diff>
--- a/units/trip_ypres/Research_Dossier_and_AI_Case_Study_Ernest_Crummack.docx
+++ b/units/trip_ypres/Research_Dossier_and_AI_Case_Study_Ernest_Crummack.docx
@@ -299,7 +299,7 @@
                 <w:sz w:val="18"/>
                 <w:szCs w:val="18"/>
               </w:rPr>
-              <w:t xml:space="preserve">Benjamin Lovett (Head of History) &amp; Edward Pearson ("John", Family Military Historian)</w:t>
+              <w:t xml:space="preserve">Benjamin Lovett (Head of History) &amp; John Pearson (Family Military Historian)</w:t>
             </w:r>
           </w:p>
         </w:tc>
@@ -429,7 +429,7 @@
           <w:sz w:val="22"/>
           <w:szCs w:val="22"/>
         </w:rPr>
-        <w:t xml:space="preserve">The research combined two distinct investigative layers: decades of foundational human scholarship conducted by military historian Edward Pearson ("John"), and high-velocity digital mining executed via modern Artificial Intelligence (AI) and digitised state repositories.</w:t>
+        <w:t xml:space="preserve">The research combined two distinct investigative layers: decades of foundational human scholarship conducted by military historian John Pearson, and high-velocity digital mining executed via modern Artificial Intelligence (AI) and digitised state repositories.</w:t>
       </w:r>
     </w:p>
     <w:p>
@@ -570,7 +570,7 @@
           <w:sz w:val="22"/>
           <w:szCs w:val="22"/>
         </w:rPr>
-        <w:t xml:space="preserve">A foundational law of historiography in the digital age is: Machine tools cannot discover truth in a vacuum. AI systems require primary coordinates established by human researchers. The investigation began with ten precise primary anchors provided from Edward Pearson’s multi-decade family archive:</w:t>
+        <w:t xml:space="preserve">A foundational law of historiography in the digital age is: Machine tools cannot discover truth in a vacuum. AI systems require primary coordinates established by human researchers. The investigation began with ten precise primary anchors provided from John Pearson’s multi-decade family archive:</w:t>
       </w:r>
     </w:p>
     <w:p>
@@ -810,7 +810,7 @@
           <w:sz w:val="22"/>
           <w:szCs w:val="22"/>
         </w:rPr>
-        <w:t xml:space="preserve">Ernest married Elizabeth Hall (Edward Pearson’s grandmother) in 1916 at Worksop.</w:t>
+        <w:t xml:space="preserve">Ernest married Elizabeth Hall in 1916 at Worksop. Their eldest child, Mary Crummack (John Pearson’s mother and Aby’s great-grandmother), carried the family’s direct DNA and lineage down to John Pearson, Harriet Uwalaka, and Aby.</w:t>
       </w:r>
     </w:p>
     <w:p>
@@ -861,16 +861,16 @@
           <w:sz w:val="22"/>
           <w:szCs w:val="22"/>
         </w:rPr>
-        <w:t xml:space="preserve">10. Interwar Legacy &amp; Passing: </w:t>
-      </w:r>
-      <w:r>
-        <w:rPr>
-          <w:rFonts w:ascii="Segoe UI" w:cs="Segoe UI" w:eastAsia="Segoe UI" w:hAnsi="Segoe UI"/>
-          <w:color w:val="334155"/>
-          <w:sz w:val="22"/>
-          <w:szCs w:val="22"/>
-        </w:rPr>
-        <w:t xml:space="preserve">Surviving interwar postcards confirm Ernest visited the Menin Gate, stayed at the Hôtel Ypriana in Ypres, and visited Albert on the Somme, before passing away peacefully in Dinnington in 1958 at age 73.</w:t>
+        <w:t xml:space="preserve">10. Interwar Legacy, Passing &amp; Regimental Museum: </w:t>
+      </w:r>
+      <w:r>
+        <w:rPr>
+          <w:rFonts w:ascii="Segoe UI" w:cs="Segoe UI" w:eastAsia="Segoe UI" w:hAnsi="Segoe UI"/>
+          <w:color w:val="334155"/>
+          <w:sz w:val="22"/>
+          <w:szCs w:val="22"/>
+        </w:rPr>
+        <w:t xml:space="preserve">Surviving interwar postcards confirm Ernest visited the Menin Gate, stayed at the Hôtel Ypriana in Ypres, and visited Albert on the Somme, before passing away peacefully in Dinnington in 1958 at age 73. His complete mounted six-medal group was presented many decades ago by his eldest son Ted Crummack to the York and Lancaster Regimental Museum at Clifton Park, Rotherham, where it remains permanently preserved.</w:t>
       </w:r>
     </w:p>
     <w:p>
@@ -1151,7 +1151,7 @@
           <w:sz w:val="22"/>
           <w:szCs w:val="22"/>
         </w:rPr>
-        <w:t xml:space="preserve">Under strict British wartime censorship, gallantry citations routinely omitted the names of rescued officers to prevent enemy intelligence from gauging command casualties. Edward Pearson had hypothesized that the rescued casualty was 2nd Lt Marcus Goodall. The research pipeline cross-referenced four independent repositories to prove this link beyond academic doubt:</w:t>
+        <w:t xml:space="preserve">Under strict British wartime censorship, gallantry citations routinely omitted the names of rescued officers to prevent enemy intelligence from gauging command casualties. John Pearson had hypothesized that the rescued casualty was 2nd Lt Marcus Goodall. The research pipeline cross-referenced four independent repositories to prove this link beyond academic doubt:</w:t>
       </w:r>
     </w:p>
     <w:p>

</xml_diff>

<commit_message>
feat(trip_ypres): Add 2nd Lt Ernest Crummack archive with dignified middle-ground family commemoration and Clifton Park Museum medals
</commit_message>
<xml_diff>
--- a/units/trip_ypres/Research_Dossier_and_AI_Case_Study_Ernest_Crummack.docx
+++ b/units/trip_ypres/Research_Dossier_and_AI_Case_Study_Ernest_Crummack.docx
@@ -299,7 +299,7 @@
                 <w:sz w:val="18"/>
                 <w:szCs w:val="18"/>
               </w:rPr>
-              <w:t xml:space="preserve">Benjamin Lovett (Head of History) &amp; Edward Pearson ("John", Family Military Historian)</w:t>
+              <w:t xml:space="preserve">Benjamin Lovett (Head of History) &amp; John Pearson (Family Military Historian)</w:t>
             </w:r>
           </w:p>
         </w:tc>
@@ -429,7 +429,7 @@
           <w:sz w:val="22"/>
           <w:szCs w:val="22"/>
         </w:rPr>
-        <w:t xml:space="preserve">The research combined two distinct investigative layers: decades of foundational human scholarship conducted by military historian Edward Pearson ("John"), and high-velocity digital mining executed via modern Artificial Intelligence (AI) and digitised state repositories.</w:t>
+        <w:t xml:space="preserve">The research combined two distinct investigative layers: decades of foundational human scholarship conducted by military historian John Pearson, and high-velocity digital mining executed via modern Artificial Intelligence (AI) and digitised state repositories.</w:t>
       </w:r>
     </w:p>
     <w:p>
@@ -570,7 +570,7 @@
           <w:sz w:val="22"/>
           <w:szCs w:val="22"/>
         </w:rPr>
-        <w:t xml:space="preserve">A foundational law of historiography in the digital age is: Machine tools cannot discover truth in a vacuum. AI systems require primary coordinates established by human researchers. The investigation began with ten precise primary anchors provided from Edward Pearson’s multi-decade family archive:</w:t>
+        <w:t xml:space="preserve">A foundational law of historiography in the digital age is: Machine tools cannot discover truth in a vacuum. AI systems require primary coordinates established by human researchers. The investigation began with ten precise primary anchors provided from John Pearson’s multi-decade family archive:</w:t>
       </w:r>
     </w:p>
     <w:p>
@@ -810,7 +810,7 @@
           <w:sz w:val="22"/>
           <w:szCs w:val="22"/>
         </w:rPr>
-        <w:t xml:space="preserve">Ernest married Elizabeth Hall (Edward Pearson’s grandmother) in 1916 at Worksop.</w:t>
+        <w:t xml:space="preserve">Ernest married Elizabeth Hall in 1916 at Worksop. Their eldest child, Mary Crummack (John Pearson’s mother and Aby’s great-grandmother), carried the family’s direct DNA and lineage down to John Pearson, Harriet Uwalaka, and Aby.</w:t>
       </w:r>
     </w:p>
     <w:p>
@@ -861,16 +861,16 @@
           <w:sz w:val="22"/>
           <w:szCs w:val="22"/>
         </w:rPr>
-        <w:t xml:space="preserve">10. Interwar Legacy &amp; Passing: </w:t>
-      </w:r>
-      <w:r>
-        <w:rPr>
-          <w:rFonts w:ascii="Segoe UI" w:cs="Segoe UI" w:eastAsia="Segoe UI" w:hAnsi="Segoe UI"/>
-          <w:color w:val="334155"/>
-          <w:sz w:val="22"/>
-          <w:szCs w:val="22"/>
-        </w:rPr>
-        <w:t xml:space="preserve">Surviving interwar postcards confirm Ernest visited the Menin Gate, stayed at the Hôtel Ypriana in Ypres, and visited Albert on the Somme, before passing away peacefully in Dinnington in 1958 at age 73.</w:t>
+        <w:t xml:space="preserve">10. Interwar Legacy, Passing &amp; Regimental Museum: </w:t>
+      </w:r>
+      <w:r>
+        <w:rPr>
+          <w:rFonts w:ascii="Segoe UI" w:cs="Segoe UI" w:eastAsia="Segoe UI" w:hAnsi="Segoe UI"/>
+          <w:color w:val="334155"/>
+          <w:sz w:val="22"/>
+          <w:szCs w:val="22"/>
+        </w:rPr>
+        <w:t xml:space="preserve">Surviving interwar postcards confirm Ernest visited the Menin Gate, stayed at the Hôtel Ypriana in Ypres, and visited Albert on the Somme, before passing away peacefully in Dinnington in 1958 at age 73. His complete mounted six-medal group was presented many decades ago by his eldest son Ted Crummack to the York and Lancaster Regimental Museum at Clifton Park, Rotherham, where it remains permanently preserved.</w:t>
       </w:r>
     </w:p>
     <w:p>
@@ -1151,7 +1151,7 @@
           <w:sz w:val="22"/>
           <w:szCs w:val="22"/>
         </w:rPr>
-        <w:t xml:space="preserve">Under strict British wartime censorship, gallantry citations routinely omitted the names of rescued officers to prevent enemy intelligence from gauging command casualties. Edward Pearson had hypothesized that the rescued casualty was 2nd Lt Marcus Goodall. The research pipeline cross-referenced four independent repositories to prove this link beyond academic doubt:</w:t>
+        <w:t xml:space="preserve">Under strict British wartime censorship, gallantry citations routinely omitted the names of rescued officers to prevent enemy intelligence from gauging command casualties. John Pearson had hypothesized that the rescued casualty was 2nd Lt Marcus Goodall. The research pipeline cross-referenced four independent repositories to prove this link beyond academic doubt:</w:t>
       </w:r>
     </w:p>
     <w:p>

</xml_diff>

<commit_message>
fix(trip_ypres): Fully anonymise living pupil and family details for GDPR and KCSIE compliance
</commit_message>
<xml_diff>
--- a/units/trip_ypres/Research_Dossier_and_AI_Case_Study_Ernest_Crummack.docx
+++ b/units/trip_ypres/Research_Dossier_and_AI_Case_Study_Ernest_Crummack.docx
@@ -412,7 +412,7 @@
           <w:sz w:val="22"/>
           <w:szCs w:val="22"/>
         </w:rPr>
-        <w:t xml:space="preserve">This dossier provides an exhaustive technical and methodological record of the archival reconstruction of 2nd Lieutenant Ernest Edward Crummack MC, DCM (1885–1958). Conducted by the Meoncross School History Department ahead of the 2026 GCSE Ypres and Somme Battlefield Study Expedition, the project set out to investigate the direct Great War ancestry of Year 10 pupil Aby (whose middle name is Ernest in his great-great-grandfather’s honour).</w:t>
+        <w:t xml:space="preserve">This dossier provides an exhaustive technical and methodological record of the archival reconstruction of 2nd Lieutenant Ernest Edward Crummack MC, DCM (1885–1958). Conducted by the Meoncross School History Department ahead of the 2026 GCSE Ypres and Somme Battlefield Study Expedition, the project set out to investigate the direct Great War ancestry of a Year 10 pupil and family.</w:t>
       </w:r>
     </w:p>
     <w:p>
@@ -810,7 +810,7 @@
           <w:sz w:val="22"/>
           <w:szCs w:val="22"/>
         </w:rPr>
-        <w:t xml:space="preserve">Ernest married Elizabeth Hall in 1916 at Worksop. Their eldest child, Mary Crummack (John Pearson’s mother and Aby’s great-grandmother), carried the family’s direct DNA and lineage down to John Pearson, Harriet Uwalaka, and Aby.</w:t>
+        <w:t xml:space="preserve">Ernest married Elizabeth Hall in 1916 at Worksop. Their eldest child, Mary Crummack (John Pearson’s mother), carried the family’s direct DNA and lineage down to family historian John Pearson and the modern family.</w:t>
       </w:r>
     </w:p>
     <w:p>

</xml_diff>